<commit_message>
Consolidate scripts/loadtest/docs into infra/ across all 26 projects
Every project's end-to-end verification script, load-test tooling, and
dashboard screenshots now live under infra/ alongside the docker-compose
files they support, instead of three separate top-level folders. CI
workflows and readme.txt updated to match; the three finalized reports
that cited these files by path (Gopi, Hrishikesh, Ebin) updated too.

Also removes project 01's docs/superpowers/ directory (a leftover
planning-skill artifact, not project content) and its dozen redundant
iteration screenshots, keeping only the two final desktop/mobile shots
consistent with every other project.
</commit_message>
<xml_diff>
--- a/documents/GopiKrishnan_X25112627/GopiKrishnan_X25112627.docx
+++ b/documents/GopiKrishnan_X25112627/GopiKrishnan_X25112627.docx
@@ -733,7 +733,7 @@
         <w:pStyle w:val="BodyText"/>
       </w:pPr>
       <w:r>
-        <w:t xml:space="preserve">The sensor tests mock the dispatch executor and event loop instead of pausing on wall-clock sleeps, so all twelve assertions -- bounded random-walk clamping at each profile's lo/hi limits, and the two independently configurable SAMPLE_INTERVAL/DISPATCH_INTERVAL knobs -- run in well under a second. A script outside the pytest suite, loadtest/burst.py, complements it with a manual capacity check: it fires a configurable batch of synthetic messages, 2,000 by default spread across 32 worker threads, at the SQS queue using five loadtest_-prefixed sensor types kept apart from the five actual ones so burst traffic can never land in the DynamoDB partitions the live dashboard reads from, then polls the queue's ApproximateNumberOfMessages and ApproximateNumberOfMessagesNotVisible attributes until it drains.</w:t>
+        <w:t xml:space="preserve">The sensor tests mock the dispatch executor and event loop instead of pausing on wall-clock sleeps, so all twelve assertions -- bounded random-walk clamping at each profile's lo/hi limits, and the two independently configurable SAMPLE_INTERVAL/DISPATCH_INTERVAL knobs -- run in well under a second. A script outside the pytest suite, infra/burst.py, complements it with a manual capacity check: it fires a configurable batch of synthetic messages, 2,000 by default spread across 32 worker threads, at the SQS queue using five loadtest_-prefixed sensor types kept apart from the five actual ones so burst traffic can never land in the DynamoDB partitions the live dashboard reads from, then polls the queue's ApproximateNumberOfMessages and ApproximateNumberOfMessagesNotVisible attributes until it drains.</w:t>
       </w:r>
     </w:p>
     <w:p>
@@ -1216,7 +1216,7 @@
         <w:pStyle w:val="BodyText"/>
       </w:pPr>
       <w:r>
-        <w:t xml:space="preserve">This evaluation carries four caveats worth naming outright, not left for a reader to infer. The Learner Lab account behind this deployment resets on a session basis, so it could not support the kind of sustained, multi-day uptime check a production system would need; everything reported here is confirmed behaviour within one continuous session, not a claim about long-run reliability. That same account also blocks provisioning a second, narrower IAM role, so mvs-processor and mvs-dashboard-api both run under one broadly scoped LabRole instead of a role scoped to each function's needs -- Section II-F covers this constraint in more detail, and it reflects an account limit, not a security choice. The third caveat is architectural: the fog and sensor tier still depends on a single EC2 instance, leaving that tier a single point of failure even though every AWS-managed component behind it is redundant; Section II-E's critical analysis explains why converting this tier to a serverless model was deferred, but deferring the fix does not close the availability gap it leaves open. The fourth caveat follows the same Learner Lab constraint as the first: loadtest/burst.py, the project's capacity-check script, was exercised against the LocalStack-backed queue during development, not against the deployed mvs-vessel-agg queue in the live account, so this report can describe how the script behaves but cannot state a measured sustained-throughput figure for the account under burst conditions.</w:t>
+        <w:t xml:space="preserve">This evaluation carries four caveats worth naming outright, not left for a reader to infer. The Learner Lab account behind this deployment resets on a session basis, so it could not support the kind of sustained, multi-day uptime check a production system would need; everything reported here is confirmed behaviour within one continuous session, not a claim about long-run reliability. That same account also blocks provisioning a second, narrower IAM role, so mvs-processor and mvs-dashboard-api both run under one broadly scoped LabRole instead of a role scoped to each function's needs -- Section II-F covers this constraint in more detail, and it reflects an account limit, not a security choice. The third caveat is architectural: the fog and sensor tier still depends on a single EC2 instance, leaving that tier a single point of failure even though every AWS-managed component behind it is redundant; Section II-E's critical analysis explains why converting this tier to a serverless model was deferred, but deferring the fix does not close the availability gap it leaves open. The fourth caveat follows the same Learner Lab constraint as the first: infra/burst.py, the project's capacity-check script, was exercised against the LocalStack-backed queue during development, not against the deployed mvs-vessel-agg queue in the live account, so this report can describe how the script behaves but cannot state a measured sustained-throughput figure for the account under burst conditions.</w:t>
       </w:r>
     </w:p>
     <w:p>

</xml_diff>

<commit_message>
Fix tables splitting across column breaks with no repeated header
The format audit found Sachin's, Gopi's, Hrishikesh's, and Jaipal's
"automated test suite by module" tables splitting mid-table at the
left/right column boundary, with the header row landing on one side
and data rows orphaned on the other with no header in view.

Added <w:tblHeader/> to each table's header row (all tables in each
of the 4 reports, not just the affected one, for consistency). In
Sachin's and Gopi's cases this caused the whole table to move
together into the next column instead of splitting at all; where a
split still occurs, the header row now repeats on both sides.

Verified: all 4 open cleanly, page counts unchanged (6 pages each).
Bag-of-words diff shows only the intentional header-row text now
appearing twice (once per repeated instance) plus one reflow
hyphenation artifact in Jaipal's report (same benign pattern seen
throughout this session's other layout fixes) -- no real content
lost.
</commit_message>
<xml_diff>
--- a/documents/GopiKrishnan_X25112627/GopiKrishnan_X25112627.docx
+++ b/documents/GopiKrishnan_X25112627/GopiKrishnan_X25112627.docx
@@ -230,6 +230,9 @@
         </w:tblBorders>
       </w:tblPr>
       <w:tr>
+        <w:trPr>
+          <w:tblHeader/>
+        </w:trPr>
         <w:tc>
           <w:tcPr>
             <w:tcW w:w="1500"/>
@@ -845,6 +848,9 @@
         </w:tblBorders>
       </w:tblPr>
       <w:tr>
+        <w:trPr>
+          <w:tblHeader/>
+        </w:trPr>
         <w:tc>
           <w:tcPr>
             <w:tcW w:w="1400"/>

</xml_diff>